<commit_message>
Scope operations for single admin marketplace
</commit_message>
<xml_diff>
--- a/docs/PRODUCT_ONLY_TRANSACTION_FIRST_NOTES-20260802.docx
+++ b/docs/PRODUCT_ONLY_TRANSACTION_FIRST_NOTES-20260802.docx
@@ -7,7 +7,7 @@
         <w:pStyle w:val="Title"/>
       </w:pPr>
       <w:r>
-        <w:t>AXIRO Base API - Marketplace Hardening Notes</w:t>
+        <w:t>AXIRO Base API - Single Admin Marketplace Closure Notes</w:t>
       </w:r>
     </w:p>
     <w:p>
@@ -17,7 +17,7 @@
     </w:p>
     <w:p>
       <w:r>
-        <w:t>This note consolidates the product-only transaction-first hardening pass after syncing selected AXIRO parent base logic.</w:t>
+        <w:t>Consolidated closure note for the one-admin-many-customers marketplace scope.</w:t>
       </w:r>
     </w:p>
     <w:p>
@@ -25,7 +25,7 @@
         <w:pStyle w:val="Heading1"/>
       </w:pPr>
       <w:r>
-        <w:t>Scope</w:t>
+        <w:t>Scope Decision</w:t>
       </w:r>
     </w:p>
     <w:p>
@@ -33,7 +33,7 @@
         <w:ind w:left="360" w:hanging="180"/>
       </w:pPr>
       <w:r>
-        <w:t>- Parent reference: mylands-api/admin develop 20260802-0359.</w:t>
+        <w:t>- Target model: one admin operator serving many customers.</w:t>
       </w:r>
     </w:p>
     <w:p>
@@ -41,7 +41,7 @@
         <w:ind w:left="360" w:hanging="180"/>
       </w:pPr>
       <w:r>
-        <w:t>- Ported only bounded marketplace primitives: decimal money math, product availability locks, idempotency, hold expiry.</w:t>
+        <w:t>- Transaction remains the business lifecycle owner for product sale/rental, payment, hold, handover, dispute and evidence.</w:t>
       </w:r>
     </w:p>
     <w:p>
@@ -49,7 +49,15 @@
         <w:ind w:left="360" w:hanging="180"/>
       </w:pPr>
       <w:r>
-        <w:t>- Excluded company/project/team, Reservation/CRM ownership chain, Accounting posting, RBAC graph, inventory and report dependencies.</w:t>
+        <w:t>- Contract CRUD is no longer published as an admin/customer integration surface; documents remain transaction evidence only.</w:t>
+      </w:r>
+    </w:p>
+    <w:p>
+      <w:pPr>
+        <w:ind w:left="360" w:hanging="180"/>
+      </w:pPr>
+      <w:r>
+        <w:t>- Excluded: RBAC, company/project/team scope, fraud engine, SLA engine, report/BI runtime and multi-step approval workflows.</w:t>
       </w:r>
     </w:p>
     <w:p>
@@ -57,7 +65,7 @@
         <w:pStyle w:val="Heading1"/>
       </w:pPr>
       <w:r>
-        <w:t>API Updates</w:t>
+        <w:t>Implemented Cleanup</w:t>
       </w:r>
     </w:p>
     <w:p>
@@ -65,7 +73,7 @@
         <w:ind w:left="360" w:hanging="180"/>
       </w:pPr>
       <w:r>
-        <w:t>- Transaction create accepts idempotency_key and availability_version.</w:t>
+        <w:t>- Operations dashboard covers overview, holds, transactions needing action, reconciliation and document checklist.</w:t>
       </w:r>
     </w:p>
     <w:p>
@@ -73,7 +81,7 @@
         <w:ind w:left="360" w:hanging="180"/>
       </w:pPr>
       <w:r>
-        <w:t>- Transactions keep request hash, pricing snapshot and availability version for audit.</w:t>
+        <w:t>- Manual release hold requires note, expected availability version and matching product hold source.</w:t>
       </w:r>
     </w:p>
     <w:p>
@@ -81,7 +89,7 @@
         <w:ind w:left="360" w:hanging="180"/>
       </w:pPr>
       <w:r>
-        <w:t>- Product availability service now validates transitions, source ownership and active holds under row locks.</w:t>
+        <w:t>- Product list query supports availability status/version for simple admin filtering.</w:t>
       </w:r>
     </w:p>
     <w:p>
@@ -89,7 +97,15 @@
         <w:ind w:left="360" w:hanging="180"/>
       </w:pPr>
       <w:r>
-        <w:t>- Hold expiry command is scheduled every five minutes.</w:t>
+        <w:t>- Idempotency replay/conflict is recorded as lightweight audit, not a separate fraud module.</w:t>
+      </w:r>
+    </w:p>
+    <w:p>
+      <w:pPr>
+        <w:pStyle w:val="Heading1"/>
+      </w:pPr>
+      <w:r>
+        <w:t>Remaining Work</w:t>
       </w:r>
     </w:p>
     <w:p>
@@ -97,15 +113,7 @@
         <w:ind w:left="360" w:hanging="180"/>
       </w:pPr>
       <w:r>
-        <w:t>- Fixed lifecycle transition from held to sold/rented for completed purchase/rental flows.</w:t>
-      </w:r>
-    </w:p>
-    <w:p>
-      <w:pPr>
-        <w:pStyle w:val="Heading1"/>
-      </w:pPr>
-      <w:r>
-        <w:t>Admin Backlog</w:t>
+        <w:t>- Add lightweight admin menu counters for overdue holds, submitted payments and open disputes.</w:t>
       </w:r>
     </w:p>
     <w:p>
@@ -113,7 +121,7 @@
         <w:ind w:left="360" w:hanging="180"/>
       </w:pPr>
       <w:r>
-        <w:t>- Hold monitor with active/expired/released holds and customer/transaction context.</w:t>
+        <w:t>- Ensure transaction detail has direct actions for payment confirmation, cancel/refund, handover and dispute closure.</w:t>
       </w:r>
     </w:p>
     <w:p>
@@ -121,31 +129,7 @@
         <w:ind w:left="360" w:hanging="180"/>
       </w:pPr>
       <w:r>
-        <w:t>- Availability timeline in product detail.</w:t>
-      </w:r>
-    </w:p>
-    <w:p>
-      <w:pPr>
-        <w:ind w:left="360" w:hanging="180"/>
-      </w:pPr>
-      <w:r>
-        <w:t>- Duplicate checkout/idempotency audit queue.</w:t>
-      </w:r>
-    </w:p>
-    <w:p>
-      <w:pPr>
-        <w:ind w:left="360" w:hanging="180"/>
-      </w:pPr>
-      <w:r>
-        <w:t>- Manual release hold action with mandatory note.</w:t>
-      </w:r>
-    </w:p>
-    <w:p>
-      <w:pPr>
-        <w:ind w:left="360" w:hanging="180"/>
-      </w:pPr>
-      <w:r>
-        <w:t>- Stuck transaction and wallet/payout exception dashboards.</w:t>
+        <w:t>- Simplify document wording from contract-first to transaction evidence where UI copy allows.</w:t>
       </w:r>
     </w:p>
     <w:p>
@@ -161,7 +145,7 @@
         <w:ind w:left="360" w:hanging="180"/>
       </w:pPr>
       <w:r>
-        <w:t>- php artisan test passed: 78 tests, 733 assertions.</w:t>
+        <w:t>- php artisan test passed with 80 tests and 747 assertions using valid test APP_KEY/JWT_SECRET.</w:t>
       </w:r>
     </w:p>
     <w:sectPr>

</xml_diff>

<commit_message>
Add notification detail settlement filters
</commit_message>
<xml_diff>
--- a/docs/PRODUCT_ONLY_TRANSACTION_FIRST_NOTES-20260802.docx
+++ b/docs/PRODUCT_ONLY_TRANSACTION_FIRST_NOTES-20260802.docx
@@ -4,7 +4,7 @@
   <w:body>
     <w:p>
       <w:r>
-        <w:t>AXIRO Base API - Marketplace Operations Closure Notes</w:t>
+        <w:t>AXIRO Base API - Notification Detail and Settlement Filter Notes</w:t>
       </w:r>
     </w:p>
     <w:p>
@@ -24,17 +24,17 @@
     </w:p>
     <w:p>
       <w:r>
-        <w:t>- Admin operations now focus on transaction notifications, rental queues and rental settlement audit.</w:t>
-      </w:r>
-    </w:p>
-    <w:p>
-      <w:r>
-        <w:t>- No Contract business module is introduced; transactions remain the lifecycle owner.</w:t>
-      </w:r>
-    </w:p>
-    <w:p>
-      <w:r>
-        <w:t>- No RBAC, company, department, project, accounting reconciliation, SLA engine, fraud engine or BI module is ported from AXIRO parent.</w:t>
+        <w:t>- Notification detail is an admin operations aid, not a new messaging or CRM module.</w:t>
+      </w:r>
+    </w:p>
+    <w:p>
+      <w:r>
+        <w:t>- Rental settlement filters and export stay inside transaction operations; no accounting reconciliation module is introduced.</w:t>
+      </w:r>
+    </w:p>
+    <w:p>
+      <w:r>
+        <w:t>- Customer copy explains deposit settlement without adding a Contract module.</w:t>
       </w:r>
     </w:p>
     <w:p>
@@ -44,17 +44,17 @@
     </w:p>
     <w:p>
       <w:r>
-        <w:t>- Aligned with recent AXIRO parent hardening around notification runtime and routing contracts.</w:t>
-      </w:r>
-    </w:p>
-    <w:p>
-      <w:r>
-        <w:t>- Kept only the parent pattern that fits Mini: queryable notification references, explicit operation queues, and source-clean packaging.</w:t>
-      </w:r>
-    </w:p>
-    <w:p>
-      <w:r>
-        <w:t>- Skipped organization hierarchy, company hub and workflow/calendar runtime because those are outside Mini marketplace scope.</w:t>
+        <w:t>- Aligned with AXIRO parent notification routing hardening and runtime UI chunk separation patterns.</w:t>
+      </w:r>
+    </w:p>
+    <w:p>
+      <w:r>
+        <w:t>- Kept route-level lazy splitting for Admin screens to reduce initial bundle pressure.</w:t>
+      </w:r>
+    </w:p>
+    <w:p>
+      <w:r>
+        <w:t>- Skipped organization hierarchy, company hub, workflow/calendar runtime and company-specific fetch optimizations because they are outside Mini scope.</w:t>
       </w:r>
     </w:p>
     <w:p>
@@ -64,27 +64,32 @@
     </w:p>
     <w:p>
       <w:r>
-        <w:t>- Admin notification center can filter by keyword, transaction, customer, notification type and read state.</w:t>
-      </w:r>
-    </w:p>
-    <w:p>
-      <w:r>
-        <w:t>- Operations dashboard now exposes rental overdue, pending return and deposit deduction review queues.</w:t>
-      </w:r>
-    </w:p>
-    <w:p>
-      <w:r>
-        <w:t>- Rental settlement audit has list API and CSV export with deduction and dispute outcome columns.</w:t>
-      </w:r>
-    </w:p>
-    <w:p>
-      <w:r>
-        <w:t>- Customer transaction detail explains deposit refund and deduction outcome.</w:t>
-      </w:r>
-    </w:p>
-    <w:p>
-      <w:r>
-        <w:t>- Contract snapshots include transaction.overdue and settlement.partially_refunded because both are runtime states.</w:t>
+        <w:t>- Admin notification detail endpoint returns customer context, transaction context and transaction timeline.</w:t>
+      </w:r>
+    </w:p>
+    <w:p>
+      <w:r>
+        <w:t>- Admin notification list opens a drawer and marks unread notifications as read after detail load.</w:t>
+      </w:r>
+    </w:p>
+    <w:p>
+      <w:r>
+        <w:t>- Rental settlement list and CSV export share filters: status, transaction, customer and completed date range.</w:t>
+      </w:r>
+    </w:p>
+    <w:p>
+      <w:r>
+        <w:t>- Admin route config uses lazy imports plus Suspense for screen-level code splitting.</w:t>
+      </w:r>
+    </w:p>
+    <w:p>
+      <w:r>
+        <w:t>- Customer rental settlement copy now emphasizes deposit reconciliation, actual returned deposit and deduction basis.</w:t>
+      </w:r>
+    </w:p>
+    <w:p>
+      <w:r>
+        <w:t>- Contract snapshots include GET /notifications/{notification}.</w:t>
       </w:r>
     </w:p>
     <w:p>
@@ -94,22 +99,22 @@
     </w:p>
     <w:p>
       <w:r>
-        <w:t>- Scope is limited to marketplace notification, operation queue, settlement audit and customer transaction detail presentation.</w:t>
-      </w:r>
-    </w:p>
-    <w:p>
-      <w:r>
-        <w:t>- API response envelope, /api/v1 routes and service boundaries are preserved.</w:t>
-      </w:r>
-    </w:p>
-    <w:p>
-      <w:r>
-        <w:t>- Frontend continues to use base list/filter/table/page primitives in Admin and existing compact customer layout in MBN React.</w:t>
-      </w:r>
-    </w:p>
-    <w:p>
-      <w:r>
-        <w:t>- Generated marketplace options fallback remains current.</w:t>
+        <w:t>- API response envelope and /api/v1 route versioning are preserved.</w:t>
+      </w:r>
+    </w:p>
+    <w:p>
+      <w:r>
+        <w:t>- Mutation boundaries remain in existing services and FormRequests; frontend reads/filters/exports only.</w:t>
+      </w:r>
+    </w:p>
+    <w:p>
+      <w:r>
+        <w:t>- No RBAC, company/project/team, SLA, fraud, BI or accounting module was added.</w:t>
+      </w:r>
+    </w:p>
+    <w:p>
+      <w:r>
+        <w:t>- Schema remains unchanged in this round.</w:t>
       </w:r>
     </w:p>
     <w:p>
@@ -119,7 +124,7 @@
     </w:p>
     <w:p>
       <w:r>
-        <w:t>- API focused tests passed: 13 tests / 263 assertions.</w:t>
+        <w:t>- API focused notification detail, settlement export filter and compatibility tests passed.</w:t>
       </w:r>
     </w:p>
     <w:p>
@@ -144,27 +149,27 @@
     </w:p>
     <w:p>
       <w:r>
-        <w:t>- Add admin detail drawer/page for a single notification with linked transaction timeline and customer context.</w:t>
-      </w:r>
-    </w:p>
-    <w:p>
-      <w:r>
-        <w:t>- Add settlement export filters by status, customer and date range before operating with larger data volumes.</w:t>
-      </w:r>
-    </w:p>
-    <w:p>
-      <w:r>
-        <w:t>- Add compatibility migrations before applying current schema changes to any database with existing data.</w:t>
-      </w:r>
-    </w:p>
-    <w:p>
-      <w:r>
-        <w:t>- Add customer-facing dispute/settlement copy review for clearer wording around deposit deductions.</w:t>
-      </w:r>
-    </w:p>
-    <w:p>
-      <w:r>
-        <w:t>- Consider code-splitting Admin heavy pages to reduce the current Vite chunk-size warning.</w:t>
+        <w:t>- Add saved filter presets for operations queues if admin usage becomes repetitive.</w:t>
+      </w:r>
+    </w:p>
+    <w:p>
+      <w:r>
+        <w:t>- Add export job/background streaming only when settlement CSV becomes too large for direct download.</w:t>
+      </w:r>
+    </w:p>
+    <w:p>
+      <w:r>
+        <w:t>- Add notification counters in the Admin shell only after unread-count polling or server push is scoped clearly.</w:t>
+      </w:r>
+    </w:p>
+    <w:p>
+      <w:r>
+        <w:t>- Prepare additive migrations before running this base against any database with existing production data.</w:t>
+      </w:r>
+    </w:p>
+    <w:p>
+      <w:r>
+        <w:t>- Continue splitting Admin shared base/AntD chunk if first-load performance becomes a real issue.</w:t>
       </w:r>
     </w:p>
     <w:sectPr>

</xml_diff>

<commit_message>
Add operations export queue counters
</commit_message>
<xml_diff>
--- a/docs/PRODUCT_ONLY_TRANSACTION_FIRST_NOTES-20260802.docx
+++ b/docs/PRODUCT_ONLY_TRANSACTION_FIRST_NOTES-20260802.docx
@@ -4,7 +4,7 @@
   <w:body>
     <w:p>
       <w:r>
-        <w:t>AXIRO Base API - Notification Detail and Settlement Filter Notes</w:t>
+        <w:t>AXIRO Base API - Operations Presets and Export Queue Notes</w:t>
       </w:r>
     </w:p>
     <w:p>
@@ -24,17 +24,17 @@
     </w:p>
     <w:p>
       <w:r>
-        <w:t>- Notification detail is an admin operations aid, not a new messaging or CRM module.</w:t>
-      </w:r>
-    </w:p>
-    <w:p>
-      <w:r>
-        <w:t>- Rental settlement filters and export stay inside transaction operations; no accounting reconciliation module is introduced.</w:t>
-      </w:r>
-    </w:p>
-    <w:p>
-      <w:r>
-        <w:t>- Customer copy explains deposit settlement without adding a Contract module.</w:t>
+        <w:t>- Saved filter presets are browser-local helpers for admin operations, not a new user preference subsystem.</w:t>
+      </w:r>
+    </w:p>
+    <w:p>
+      <w:r>
+        <w:t>- Queued rental settlement export stays inside marketplace operations and does not introduce accounting/BI.</w:t>
+      </w:r>
+    </w:p>
+    <w:p>
+      <w:r>
+        <w:t>- Unread notification counters are lightweight overview metrics; no server push is added yet.</w:t>
       </w:r>
     </w:p>
     <w:p>
@@ -44,17 +44,17 @@
     </w:p>
     <w:p>
       <w:r>
-        <w:t>- Aligned with AXIRO parent notification routing hardening and runtime UI chunk separation patterns.</w:t>
-      </w:r>
-    </w:p>
-    <w:p>
-      <w:r>
-        <w:t>- Kept route-level lazy splitting for Admin screens to reduce initial bundle pressure.</w:t>
-      </w:r>
-    </w:p>
-    <w:p>
-      <w:r>
-        <w:t>- Skipped organization hierarchy, company hub, workflow/calendar runtime and company-specific fetch optimizations because they are outside Mini scope.</w:t>
+        <w:t>- Aligned with AXIRO parent direction around import/export cleanup, notification runtime hardening and source-clean packaging.</w:t>
+      </w:r>
+    </w:p>
+    <w:p>
+      <w:r>
+        <w:t>- Kept only patterns that fit Mini: queued export request, authenticated download, expiry and lightweight counters.</w:t>
+      </w:r>
+    </w:p>
+    <w:p>
+      <w:r>
+        <w:t>- Skipped audit-retention, organization hierarchy, company hub and workflow/calendar runtime because they exceed Mini marketplace scope.</w:t>
       </w:r>
     </w:p>
     <w:p>
@@ -64,32 +64,32 @@
     </w:p>
     <w:p>
       <w:r>
-        <w:t>- Admin notification detail endpoint returns customer context, transaction context and transaction timeline.</w:t>
-      </w:r>
-    </w:p>
-    <w:p>
-      <w:r>
-        <w:t>- Admin notification list opens a drawer and marks unread notifications as read after detail load.</w:t>
-      </w:r>
-    </w:p>
-    <w:p>
-      <w:r>
-        <w:t>- Rental settlement list and CSV export share filters: status, transaction, customer and completed date range.</w:t>
-      </w:r>
-    </w:p>
-    <w:p>
-      <w:r>
-        <w:t>- Admin route config uses lazy imports plus Suspense for screen-level code splitting.</w:t>
-      </w:r>
-    </w:p>
-    <w:p>
-      <w:r>
-        <w:t>- Customer rental settlement copy now emphasizes deposit reconciliation, actual returned deposit and deduction basis.</w:t>
-      </w:r>
-    </w:p>
-    <w:p>
-      <w:r>
-        <w:t>- Contract snapshots include GET /notifications/{notification}.</w:t>
+        <w:t>- Added MarketplaceExportRequest and BuildRentalSettlementExport for queued rental settlement CSV generation.</w:t>
+      </w:r>
+    </w:p>
+    <w:p>
+      <w:r>
+        <w:t>- Added export status polling and authenticated download endpoints.</w:t>
+      </w:r>
+    </w:p>
+    <w:p>
+      <w:r>
+        <w:t>- Added unread notification counter in operations overview and Admin sidebar badge.</w:t>
+      </w:r>
+    </w:p>
+    <w:p>
+      <w:r>
+        <w:t>- Added local saved filter presets for operations queues and settlement filters.</w:t>
+      </w:r>
+    </w:p>
+    <w:p>
+      <w:r>
+        <w:t>- Added contract routes for queued settlement export endpoints across API/Admin/Customer snapshots.</w:t>
+      </w:r>
+    </w:p>
+    <w:p>
+      <w:r>
+        <w:t>- Adjusted Admin Vite manual chunks for React, Ant Design, HTTP and date dependencies.</w:t>
       </w:r>
     </w:p>
     <w:p>
@@ -104,17 +104,17 @@
     </w:p>
     <w:p>
       <w:r>
-        <w:t>- Mutation boundaries remain in existing services and FormRequests; frontend reads/filters/exports only.</w:t>
-      </w:r>
-    </w:p>
-    <w:p>
-      <w:r>
-        <w:t>- No RBAC, company/project/team, SLA, fraud, BI or accounting module was added.</w:t>
-      </w:r>
-    </w:p>
-    <w:p>
-      <w:r>
-        <w:t>- Schema remains unchanged in this round.</w:t>
+        <w:t>- No RBAC, company/project/team, SLA engine, fraud engine, BI subsystem or accounting reconciliation was introduced.</w:t>
+      </w:r>
+    </w:p>
+    <w:p>
+      <w:r>
+        <w:t>- Schema is still edited in canonical baseline migrations because the project is unreleased; additive migrations are required before preserving live data.</w:t>
+      </w:r>
+    </w:p>
+    <w:p>
+      <w:r>
+        <w:t>- Admin build still reports a large Ant Design vendor chunk; this is a performance follow-up, not a merge blocker.</w:t>
       </w:r>
     </w:p>
     <w:p>
@@ -124,7 +124,7 @@
     </w:p>
     <w:p>
       <w:r>
-        <w:t>- API focused notification detail, settlement export filter and compatibility tests passed.</w:t>
+        <w:t>- API focused operations/export/lifecycle/contract tests passed.</w:t>
       </w:r>
     </w:p>
     <w:p>
@@ -149,27 +149,27 @@
     </w:p>
     <w:p>
       <w:r>
-        <w:t>- Add saved filter presets for operations queues if admin usage becomes repetitive.</w:t>
-      </w:r>
-    </w:p>
-    <w:p>
-      <w:r>
-        <w:t>- Add export job/background streaming only when settlement CSV becomes too large for direct download.</w:t>
-      </w:r>
-    </w:p>
-    <w:p>
-      <w:r>
-        <w:t>- Add notification counters in the Admin shell only after unread-count polling or server push is scoped clearly.</w:t>
-      </w:r>
-    </w:p>
-    <w:p>
-      <w:r>
-        <w:t>- Prepare additive migrations before running this base against any database with existing production data.</w:t>
-      </w:r>
-    </w:p>
-    <w:p>
-      <w:r>
-        <w:t>- Continue splitting Admin shared base/AntD chunk if first-load performance becomes a real issue.</w:t>
+        <w:t>- Add export cleanup command for expired MarketplaceExportRequest files if queued export becomes regular usage.</w:t>
+      </w:r>
+    </w:p>
+    <w:p>
+      <w:r>
+        <w:t>- Add per-admin saved presets only if shared machines or role-based usage appears; localStorage is enough for now.</w:t>
+      </w:r>
+    </w:p>
+    <w:p>
+      <w:r>
+        <w:t>- Add admin export history list when multiple queued exports can be pending at once.</w:t>
+      </w:r>
+    </w:p>
+    <w:p>
+      <w:r>
+        <w:t>- Prepare additive migrations before applying this baseline to a live database.</w:t>
+      </w:r>
+    </w:p>
+    <w:p>
+      <w:r>
+        <w:t>- Continue splitting or reducing Ant Design usage only if first-load metrics show real pain.</w:t>
       </w:r>
     </w:p>
     <w:sectPr>

</xml_diff>

<commit_message>
Align admin base lifecycle documentation
</commit_message>
<xml_diff>
--- a/docs/PRODUCT_ONLY_TRANSACTION_FIRST_NOTES-20260802.docx
+++ b/docs/PRODUCT_ONLY_TRANSACTION_FIRST_NOTES-20260802.docx
@@ -4,7 +4,7 @@
   <w:body>
     <w:p>
       <w:r>
-        <w:t>AXIRO Base API - Operations Presets and Export Queue Notes</w:t>
+        <w:t>AXIRO Base API - Notification Detail and Settlement Filter Notes</w:t>
       </w:r>
     </w:p>
     <w:p>
@@ -24,17 +24,17 @@
     </w:p>
     <w:p>
       <w:r>
-        <w:t>- Saved filter presets are browser-local helpers for admin operations, not a new user preference subsystem.</w:t>
-      </w:r>
-    </w:p>
-    <w:p>
-      <w:r>
-        <w:t>- Queued rental settlement export stays inside marketplace operations and does not introduce accounting/BI.</w:t>
-      </w:r>
-    </w:p>
-    <w:p>
-      <w:r>
-        <w:t>- Unread notification counters are lightweight overview metrics; no server push is added yet.</w:t>
+        <w:t>- Notification detail is an admin operations aid, not a new messaging or CRM module.</w:t>
+      </w:r>
+    </w:p>
+    <w:p>
+      <w:r>
+        <w:t>- Rental settlement filters and export stay inside transaction operations; no accounting reconciliation module is introduced.</w:t>
+      </w:r>
+    </w:p>
+    <w:p>
+      <w:r>
+        <w:t>- Customer copy explains deposit settlement without adding a Contract module.</w:t>
       </w:r>
     </w:p>
     <w:p>
@@ -44,17 +44,17 @@
     </w:p>
     <w:p>
       <w:r>
-        <w:t>- Aligned with AXIRO parent direction around import/export cleanup, notification runtime hardening and source-clean packaging.</w:t>
-      </w:r>
-    </w:p>
-    <w:p>
-      <w:r>
-        <w:t>- Kept only patterns that fit Mini: queued export request, authenticated download, expiry and lightweight counters.</w:t>
-      </w:r>
-    </w:p>
-    <w:p>
-      <w:r>
-        <w:t>- Skipped audit-retention, organization hierarchy, company hub and workflow/calendar runtime because they exceed Mini marketplace scope.</w:t>
+        <w:t>- Aligned with AXIRO parent notification routing hardening and runtime UI chunk separation patterns.</w:t>
+      </w:r>
+    </w:p>
+    <w:p>
+      <w:r>
+        <w:t>- Kept route-level lazy splitting for Admin screens to reduce initial bundle pressure.</w:t>
+      </w:r>
+    </w:p>
+    <w:p>
+      <w:r>
+        <w:t>- Skipped organization hierarchy, company hub, workflow/calendar runtime and company-specific fetch optimizations because they are outside Mini scope.</w:t>
       </w:r>
     </w:p>
     <w:p>
@@ -64,32 +64,32 @@
     </w:p>
     <w:p>
       <w:r>
-        <w:t>- Added MarketplaceExportRequest and BuildRentalSettlementExport for queued rental settlement CSV generation.</w:t>
-      </w:r>
-    </w:p>
-    <w:p>
-      <w:r>
-        <w:t>- Added export status polling and authenticated download endpoints.</w:t>
-      </w:r>
-    </w:p>
-    <w:p>
-      <w:r>
-        <w:t>- Added unread notification counter in operations overview and Admin sidebar badge.</w:t>
-      </w:r>
-    </w:p>
-    <w:p>
-      <w:r>
-        <w:t>- Added local saved filter presets for operations queues and settlement filters.</w:t>
-      </w:r>
-    </w:p>
-    <w:p>
-      <w:r>
-        <w:t>- Added contract routes for queued settlement export endpoints across API/Admin/Customer snapshots.</w:t>
-      </w:r>
-    </w:p>
-    <w:p>
-      <w:r>
-        <w:t>- Adjusted Admin Vite manual chunks for React, Ant Design, HTTP and date dependencies.</w:t>
+        <w:t>- Admin notification detail endpoint returns customer context, transaction context and transaction timeline.</w:t>
+      </w:r>
+    </w:p>
+    <w:p>
+      <w:r>
+        <w:t>- Admin notification list opens a drawer and marks unread notifications as read after detail load.</w:t>
+      </w:r>
+    </w:p>
+    <w:p>
+      <w:r>
+        <w:t>- Rental settlement list and CSV export share filters: status, transaction, customer and completed date range.</w:t>
+      </w:r>
+    </w:p>
+    <w:p>
+      <w:r>
+        <w:t>- Admin route config uses lazy imports plus Suspense for screen-level code splitting.</w:t>
+      </w:r>
+    </w:p>
+    <w:p>
+      <w:r>
+        <w:t>- Customer rental settlement copy now emphasizes deposit reconciliation, actual returned deposit and deduction basis.</w:t>
+      </w:r>
+    </w:p>
+    <w:p>
+      <w:r>
+        <w:t>- Contract snapshots include GET /notifications/{notification}.</w:t>
       </w:r>
     </w:p>
     <w:p>
@@ -104,17 +104,17 @@
     </w:p>
     <w:p>
       <w:r>
-        <w:t>- No RBAC, company/project/team, SLA engine, fraud engine, BI subsystem or accounting reconciliation was introduced.</w:t>
-      </w:r>
-    </w:p>
-    <w:p>
-      <w:r>
-        <w:t>- Schema is still edited in canonical baseline migrations because the project is unreleased; additive migrations are required before preserving live data.</w:t>
-      </w:r>
-    </w:p>
-    <w:p>
-      <w:r>
-        <w:t>- Admin build still reports a large Ant Design vendor chunk; this is a performance follow-up, not a merge blocker.</w:t>
+        <w:t>- Mutation boundaries remain in existing services and FormRequests; frontend reads/filters/exports only.</w:t>
+      </w:r>
+    </w:p>
+    <w:p>
+      <w:r>
+        <w:t>- No RBAC, company/project/team, SLA, fraud, BI or accounting module was added.</w:t>
+      </w:r>
+    </w:p>
+    <w:p>
+      <w:r>
+        <w:t>- Schema remains unchanged in this round.</w:t>
       </w:r>
     </w:p>
     <w:p>
@@ -124,7 +124,7 @@
     </w:p>
     <w:p>
       <w:r>
-        <w:t>- API focused operations/export/lifecycle/contract tests passed.</w:t>
+        <w:t>- API focused notification detail, settlement export filter and compatibility tests passed.</w:t>
       </w:r>
     </w:p>
     <w:p>
@@ -149,27 +149,65 @@
     </w:p>
     <w:p>
       <w:r>
-        <w:t>- Add export cleanup command for expired MarketplaceExportRequest files if queued export becomes regular usage.</w:t>
-      </w:r>
-    </w:p>
-    <w:p>
-      <w:r>
-        <w:t>- Add per-admin saved presets only if shared machines or role-based usage appears; localStorage is enough for now.</w:t>
-      </w:r>
-    </w:p>
-    <w:p>
-      <w:r>
-        <w:t>- Add admin export history list when multiple queued exports can be pending at once.</w:t>
-      </w:r>
-    </w:p>
-    <w:p>
-      <w:r>
-        <w:t>- Prepare additive migrations before applying this baseline to a live database.</w:t>
-      </w:r>
-    </w:p>
-    <w:p>
-      <w:r>
-        <w:t>- Continue splitting or reducing Ant Design usage only if first-load metrics show real pain.</w:t>
+        <w:t>- Add saved filter presets for operations queues if admin usage becomes repetitive.</w:t>
+      </w:r>
+    </w:p>
+    <w:p>
+      <w:r>
+        <w:t>- Add export job/background streaming only when settlement CSV becomes too large for direct download.</w:t>
+      </w:r>
+    </w:p>
+    <w:p>
+      <w:r>
+        <w:t>- Add notification counters in the Admin shell only after unread-count polling or server push is scoped clearly.</w:t>
+      </w:r>
+    </w:p>
+    <w:p>
+      <w:r>
+        <w:t>- Prepare additive migrations before running this base against any database with existing production data.</w:t>
+      </w:r>
+    </w:p>
+    <w:p>
+      <w:r>
+        <w:t>- Continue splitting Admin shared base/AntD chunk if first-load performance becomes a real issue.</w:t>
+      </w:r>
+    </w:p>
+    <w:p>
+      <w:r>
+        <w:rPr>
+          <w:b/>
+        </w:rPr>
+        <w:t>Admin Base CRUD and Action Lifecycle Alignment - 2026-08-03</w:t>
+      </w:r>
+    </w:p>
+    <w:p>
+      <w:r>
+        <w:t>- Product, Customer and Transaction admin forms now follow BaseFormPage/BaseForm/BaseFormFooter ownership instead of ad hoc card/button layouts.</w:t>
+      </w:r>
+    </w:p>
+    <w:p>
+      <w:r>
+        <w:t>- Transaction detail now uses the base page header and requires confirmation for payment confirmation and document synchronization.</w:t>
+      </w:r>
+    </w:p>
+    <w:p>
+      <w:r>
+        <w:t>- Document synchronization errors now surface to the admin instead of silently clearing loading state.</w:t>
+      </w:r>
+    </w:p>
+    <w:p>
+      <w:r>
+        <w:t>- Parent classification: mini_bounded. Mini follows AXIRO parent base/action patterns without importing parent module registry, permission graph, company/project scope, accounting or report dependencies.</w:t>
+      </w:r>
+    </w:p>
+    <w:p>
+      <w:r>
+        <w:t>- Verification required: Admin format/source-closure/lint/build and API full PHPUnit after shared transaction/action changes.</w:t>
+      </w:r>
+    </w:p>
+    <w:p>
+      <w:r>
+        <w:t>- Visual DOCX render QA skipped because LibreOffice/soffice is unavailable in this environment.</w:t>
       </w:r>
     </w:p>
     <w:sectPr>

</xml_diff>

<commit_message>
Add transaction command center contract
</commit_message>
<xml_diff>
--- a/docs/PRODUCT_ONLY_TRANSACTION_FIRST_NOTES-20260802.docx
+++ b/docs/PRODUCT_ONLY_TRANSACTION_FIRST_NOTES-20260802.docx
@@ -203,6 +203,54 @@
     <w:p>
       <w:r>
         <w:t>- Verification required: Admin format/source-closure/lint/build and API full PHPUnit after shared transaction/action changes.</w:t>
+      </w:r>
+    </w:p>
+    <w:p>
+      <w:r>
+        <w:t>- Visual DOCX render QA skipped because LibreOffice/soffice is unavailable in this environment.</w:t>
+      </w:r>
+    </w:p>
+    <w:p>
+      <w:r>
+        <w:rPr>
+          <w:b/>
+        </w:rPr>
+        <w:t>Transaction Command Center and Customer Journey - 2026-08-03</w:t>
+      </w:r>
+    </w:p>
+    <w:p>
+      <w:r>
+        <w:t>- Backend now owns transaction lifecycle labels, phases, next actions and blocked reasons through TransactionLifecycleCatalog.</w:t>
+      </w:r>
+    </w:p>
+    <w:p>
+      <w:r>
+        <w:t>- TransactionDetailPresenter exposes admin command center and customer journey shapes without adding Contract, RBAC, company, accounting or report dependencies.</w:t>
+      </w:r>
+    </w:p>
+    <w:p>
+      <w:r>
+        <w:t>- Admin transaction detail shows next action, checklist, pending payments and locked actions; payment confirmation remains protected by a confirm action.</w:t>
+      </w:r>
+    </w:p>
+    <w:p>
+      <w:r>
+        <w:t>- Customer purchase detail shows the next step, checklist and top blocking reasons so customers do not need to infer the workflow from raw statuses.</w:t>
+      </w:r>
+    </w:p>
+    <w:p>
+      <w:r>
+        <w:t>- Operations queues expose the next action label for stuck transactions to help admin triage faster.</w:t>
+      </w:r>
+    </w:p>
+    <w:p>
+      <w:r>
+        <w:t>- Parent classification: mini_bounded. Mini follows AXIRO parent lifecycle/presenter/action patterns while keeping transaction as the lifecycle owner.</w:t>
+      </w:r>
+    </w:p>
+    <w:p>
+      <w:r>
+        <w:t>- Verification: API full PHPUnit, Admin source/api/command-center checks and build, MBN customer-journey/base/api checks and build passed.</w:t>
       </w:r>
     </w:p>
     <w:p>

</xml_diff>

<commit_message>
Split document and payout services
</commit_message>
<xml_diff>
--- a/docs/PRODUCT_ONLY_TRANSACTION_FIRST_NOTES-20260802.docx
+++ b/docs/PRODUCT_ONLY_TRANSACTION_FIRST_NOTES-20260802.docx
@@ -256,6 +256,44 @@
     <w:p>
       <w:r>
         <w:t>- Visual DOCX render QA skipped because LibreOffice/soffice is unavailable in this environment.</w:t>
+      </w:r>
+    </w:p>
+    <w:p>
+      <w:r>
+        <w:rPr>
+          <w:b/>
+        </w:rPr>
+        <w:t>Refactor and Release Guard Update - 2026-08-03</w:t>
+      </w:r>
+    </w:p>
+    <w:p>
+      <w:r>
+        <w:t>Scope decision: Mini remains a one-admin-many-customers marketplace base. Customer/product/transaction/wallet/payout/document operations are in scope; company, department, project, HR, accounting, BI reports, CRM reservations and generic workflow automation remain excluded.</w:t>
+      </w:r>
+    </w:p>
+    <w:p>
+      <w:r>
+        <w:t>MBN React: large content and customer page responsibilities were split into lazy data groups, marketplace config and dedicated hooks for product form, purchase detail actions and payout page behavior. Release package and semantic-owner guards were added.</w:t>
+      </w:r>
+    </w:p>
+    <w:p>
+      <w:r>
+        <w:t>AXIRO Admin: relation option behavior was split into resolver, cache and normalizer owners. Transaction detail presentation was split into section panels while keeping BaseView/BaseForm/BaseList ownership.</w:t>
+      </w:r>
+    </w:p>
+    <w:p>
+      <w:r>
+        <w:t>AXIRO API: marketplace document payload/rendering and withdrawal state transitions were separated from coordinator services. Controllers, FormRequest validation, resources and transactional lifecycle services remain the owners.</w:t>
+      </w:r>
+    </w:p>
+    <w:p>
+      <w:r>
+        <w:t>Validation: MBN release/semantic/ownership/base/API/customer-flow gates, lint and build passed. Admin check:all, lint and build passed. API Pint and full PHPUnit passed.</w:t>
+      </w:r>
+    </w:p>
+    <w:p>
+      <w:r>
+        <w:t>Next work: browser QA for login, avatar upload, buy/rent/installment, deposit and payout flows; continue splitting only where a clear owner boundary exists; keep generated contract fallbacks synced before every package.</w:t>
       </w:r>
     </w:p>
     <w:sectPr>

</xml_diff>

<commit_message>
Stabilize marketplace release verification
</commit_message>
<xml_diff>
--- a/docs/PRODUCT_ONLY_TRANSACTION_FIRST_NOTES-20260802.docx
+++ b/docs/PRODUCT_ONLY_TRANSACTION_FIRST_NOTES-20260802.docx
@@ -332,6 +332,39 @@
     <w:p>
       <w:r>
         <w:t>Remaining verification limits: browser core smoke requires real MBN_E2E_LOGIN and MBN_E2E_PASSWORD; DOCX visual render QA requires LibreOffice/soffice.</w:t>
+      </w:r>
+    </w:p>
+    <w:p>
+      <w:pPr>
+        <w:pStyle w:val="Heading1"/>
+      </w:pPr>
+      <w:r>
+        <w:t>Baseline release 2026-08-03</w:t>
+      </w:r>
+    </w:p>
+    <w:p>
+      <w:r>
+        <w:t>• Marketplace contract version: 2026-08-03.1.</w:t>
+      </w:r>
+    </w:p>
+    <w:p>
+      <w:r>
+        <w:t>• Accepted commits: Admin e3e1c2d; API 0f118e4; MBN e64ce96.</w:t>
+      </w:r>
+    </w:p>
+    <w:p>
+      <w:r>
+        <w:t>• Parent alignment: mini_bounded. AXIRO Mini kế thừa pattern phù hợp nhưng không tuyên bố exact parity với AXIRO cha và không port company, department, employee, HR, accounting, project hoặc compliance runtime.</w:t>
+      </w:r>
+    </w:p>
+    <w:p>
+      <w:r>
+        <w:t>• Browser smoke là gate bắt buộc trước merge hoặc phải có waiver bằng văn bản. Transactional E2E chỉ chạy trên database test đã migrate:fresh --seed.</w:t>
+      </w:r>
+    </w:p>
+    <w:p>
+      <w:r>
+        <w:t>• Các debt còn lại: chạy browser smoke với tài khoản thật, theo dõi bundle bằng số đo production build, và tiếp tục audit UX/selector dựa trên bằng chứng thực tế.</w:t>
       </w:r>
     </w:p>
     <w:sectPr>

</xml_diff>

<commit_message>
chore: finalize release evidence and packaging gates
</commit_message>
<xml_diff>
--- a/docs/PRODUCT_ONLY_TRANSACTION_FIRST_NOTES-20260802.docx
+++ b/docs/PRODUCT_ONLY_TRANSACTION_FIRST_NOTES-20260802.docx
@@ -584,6 +584,35 @@
       </w:pPr>
       <w:r>
         <w:t>• Current contract version remains 2026-08-04.1 and the Mini runtime remains bounded to customer, product, transaction, payment, wallet, payout, document, support and trust domains.</w:t>
+      </w:r>
+    </w:p>
+    <w:p>
+      <w:r>
+        <w:rPr>
+          <w:b/>
+          <w:sz w:val="28"/>
+        </w:rPr>
+        <w:t>Remaining Tasks Closure Update - 2026-08-04</w:t>
+      </w:r>
+    </w:p>
+    <w:p>
+      <w:r>
+        <w:t>• Admin moved ConfigProvider, Vietnamese locale, and the static message holder out of main.jsx into AdminThemeProvider, imported only by lazy Login and AdminLayout owners. A fresh build:analyze is required before claiming a new initial JS measurement.</w:t>
+      </w:r>
+    </w:p>
+    <w:p>
+      <w:r>
+        <w:t>• The release summary now records individual API, Admin, MBN, browser, transactional, DOCX, and packaging gates together with the exact pre-release Git hashes.</w:t>
+      </w:r>
+    </w:p>
+    <w:p>
+      <w:r>
+        <w:t>• The PHP evidence finalizer only promotes browser, transactional, and DOCX results when the release summary passed and all three source hashes match the current clean pushed HEAD values. Stale summaries are rejected.</w:t>
+      </w:r>
+    </w:p>
+    <w:p>
+      <w:r>
+        <w:t>• Previous bundle and browser results remain historical and are pending re-verification after this source change. No pass status is inferred from source guards alone.</w:t>
       </w:r>
     </w:p>
     <w:sectPr>

</xml_diff>

<commit_message>
chore: finalize runtime evidence packaging
</commit_message>
<xml_diff>
--- a/docs/PRODUCT_ONLY_TRANSACTION_FIRST_NOTES-20260802.docx
+++ b/docs/PRODUCT_ONLY_TRANSACTION_FIRST_NOTES-20260802.docx
@@ -616,118 +616,41 @@
       </w:r>
     </w:p>
     <w:p>
-      <w:r>
-        <w:br w:type="page"/>
-      </w:r>
-    </w:p>
-    <w:p>
       <w:pPr>
         <w:pStyle w:val="Heading1"/>
       </w:pPr>
       <w:r>
-        <w:t>Final Canonical Closure - 2026-08-04</w:t>
-      </w:r>
-    </w:p>
-    <w:p>
-      <w:r>
-        <w:rPr>
-          <w:b/>
-        </w:rPr>
-        <w:t xml:space="preserve">Contract: </w:t>
-      </w:r>
-      <w:r>
-        <w:t>2026-08-04.1</w:t>
-      </w:r>
-    </w:p>
-    <w:p>
-      <w:r>
-        <w:rPr>
-          <w:b/>
-        </w:rPr>
-        <w:t xml:space="preserve">Scope: </w:t>
-      </w:r>
-      <w:r>
-        <w:t>mini_bounded; one Admin, multiple customers; no runtime company/RBAC/HR/accounting/report/project.</w:t>
-      </w:r>
-    </w:p>
-    <w:p>
-      <w:r>
-        <w:rPr>
-          <w:b/>
-        </w:rPr>
-        <w:t>Closed source areas</w:t>
-      </w:r>
-    </w:p>
-    <w:p>
-      <w:pPr>
-        <w:pStyle w:val="ListParagraph"/>
-      </w:pPr>
-      <w:r>
-        <w:t>• BaseForm semantic grid, responsive BaseFilter, shared confirm/reject review UX and canonical enum labels.</w:t>
-      </w:r>
-    </w:p>
-    <w:p>
-      <w:pPr>
-        <w:pStyle w:val="ListParagraph"/>
-      </w:pPr>
-      <w:r>
-        <w:t>• Transaction/payment/payout/document lifecycle owners, fresh demo fixtures and customer isolation contracts.</w:t>
-      </w:r>
-    </w:p>
-    <w:p>
-      <w:pPr>
-        <w:pStyle w:val="ListParagraph"/>
-      </w:pPr>
-      <w:r>
-        <w:t>• Admin initial bundle ownership, lazy route owners, MBN page/data/CSS owners and release package guards.</w:t>
-      </w:r>
-    </w:p>
-    <w:p>
-      <w:pPr>
-        <w:pStyle w:val="ListParagraph"/>
-      </w:pPr>
-      <w:r>
-        <w:t>• PHP finalizer promotes browser/E2E/DOCX evidence only from a passed, hash-matched release summary.</w:t>
-      </w:r>
-    </w:p>
-    <w:p>
-      <w:r>
-        <w:rPr>
-          <w:b/>
-        </w:rPr>
-        <w:t>Runtime gates still required before a new tag</w:t>
-      </w:r>
-    </w:p>
-    <w:p>
-      <w:pPr>
-        <w:pStyle w:val="ListParagraph"/>
-      </w:pPr>
-      <w:r>
-        <w:t>• Run composer release:all on a fresh testing database with valid Admin/MBN browser credentials.</w:t>
-      </w:r>
-    </w:p>
-    <w:p>
-      <w:pPr>
-        <w:pStyle w:val="ListParagraph"/>
-      </w:pPr>
-      <w:r>
-        <w:t>• Require non-skip document-template successor mutation and verify version plus supersedes_template_id.</w:t>
-      </w:r>
-    </w:p>
-    <w:p>
-      <w:pPr>
-        <w:pStyle w:val="ListParagraph"/>
-      </w:pPr>
-      <w:r>
-        <w:t>• Render DOCX through the official release runner and inspect every page.</w:t>
-      </w:r>
-    </w:p>
-    <w:p>
-      <w:pPr>
-        <w:pStyle w:val="ListParagraph"/>
-      </w:pPr>
-      <w:r>
-        <w:t>• Run release:finalize-evidence only after all three source commits are clean, pushed and hash-matched.</w:t>
+        <w:t>Bundle, Security and Visual Closure - 2026-08-04</w:t>
+      </w:r>
+    </w:p>
+    <w:p>
+      <w:r>
+        <w:t>• Admin transaction detail mounts only the active payment, document, timeline or admin-action panel.</w:t>
+      </w:r>
+    </w:p>
+    <w:p>
+      <w:r>
+        <w:t>• MBN application theme shell and account/page styles are route-owned instead of being forced into the initial entry.</w:t>
+      </w:r>
+    </w:p>
+    <w:p>
+      <w:r>
+        <w:t>• Axios security floor is 1.19.0 and form-data security floor is 4.0.6; npm audit is a required release gate.</w:t>
+      </w:r>
+    </w:p>
+    <w:p>
+      <w:r>
+        <w:t>• Admin and MBN visual regression gates cover desktop, tablet and mobile layouts, horizontal overflow and compressed form controls.</w:t>
+      </w:r>
+    </w:p>
+    <w:p>
+      <w:r>
+        <w:t>• Bundle and browser evidence must be regenerated after these source changes; previous measurements remain historical only.</w:t>
+      </w:r>
+    </w:p>
+    <w:p>
+      <w:r>
+        <w:t>• Runtime scope remains Mini bounded: customer, product, transaction, payment, wallet, payout, document, support and trust.</w:t>
       </w:r>
     </w:p>
     <w:sectPr>

</xml_diff>

<commit_message>
feat: harden escrow box lifecycle and parent activity timeline
</commit_message>
<xml_diff>
--- a/docs/PRODUCT_ONLY_TRANSACTION_FIRST_NOTES-20260802.docx
+++ b/docs/PRODUCT_ONLY_TRANSACTION_FIRST_NOTES-20260802.docx
@@ -823,6 +823,130 @@
     <w:p>
       <w:r>
         <w:t>Không lưu hoặc yêu cầu mật khẩu, OTP, mã khôi phục, cookie hay secret trong schema, note, form hoặc document merge fields. Demo có ITEM-0901 cho luồng in_game_trade; transactional E2E source bao phủ snapshot, inspection deadline, rental và item handover. Browser, PHPUnit, transactional E2E và release:all phải chạy lại từ clean pushed HEAD trước khi finalize evidence.</w:t>
+      </w:r>
+    </w:p>
+    <w:p>
+      <w:pPr>
+        <w:pStyle w:val="Heading1"/>
+        <w:pageBreakBefore/>
+      </w:pPr>
+      <w:r>
+        <w:t>Escrow Box validation and counterparty lifecycle hardening</w:t>
+      </w:r>
+    </w:p>
+    <w:p>
+      <w:r>
+        <w:t>• Escrow Box create and terms-edit screens now share BaseForm state, nested field errors, and one payload builder.</w:t>
+      </w:r>
+    </w:p>
+    <w:p>
+      <w:r>
+        <w:t>• Horizontal exchange omits top-up fields; only exchange with top-up requires at least 1,000 VND.</w:t>
+      </w:r>
+    </w:p>
+    <w:p>
+      <w:r>
+        <w:t>• Escrow Box detail keeps all React hooks above loading and error returns.</w:t>
+      </w:r>
+    </w:p>
+    <w:p>
+      <w:r>
+        <w:t>• Phone invitations use database-bounded lookup, row locking, privacy aliases, cancel-before-accept, and replacement support.</w:t>
+      </w:r>
+    </w:p>
+    <w:p>
+      <w:r>
+        <w:t>• A cancelled invite returns the Box to awaiting_counterparty and sends a neutral notification to the removed invitee.</w:t>
+      </w:r>
+    </w:p>
+    <w:p>
+      <w:r>
+        <w:t>• After acceptance, participant replacement is forbidden; financial, handover, dispute, and settlement owners remain canonical.</w:t>
+      </w:r>
+    </w:p>
+    <w:p>
+      <w:r>
+        <w:t>• Source, recovery, package, ownership, and syntax guards pass. Runtime Pint, PHPUnit, lint, build, browser, E2E, and release evidence require rerun on clean Git repositories.</w:t>
+      </w:r>
+    </w:p>
+    <w:p>
+      <w:pPr>
+        <w:pStyle w:val="Heading1"/>
+      </w:pPr>
+      <w:r>
+        <w:t>Parent Activity Timeline runtime closure</w:t>
+      </w:r>
+    </w:p>
+    <w:p>
+      <w:pPr>
+        <w:pStyle w:val="ListParagraph"/>
+      </w:pPr>
+      <w:r>
+        <w:t>• AXIRO Mini dùng cùng activity/timeline contract với AXIRO Cha; useTimeline là exact source.</w:t>
+      </w:r>
+    </w:p>
+    <w:p>
+      <w:pPr>
+        <w:pStyle w:val="ListParagraph"/>
+      </w:pPr>
+      <w:r>
+        <w:t>• EscrowBoxEvent và customer Bên A/B masking là bounded adapter của Mini, không kéo company, RBAC, Audit Center hoặc Activity Inbox.</w:t>
+      </w:r>
+    </w:p>
+    <w:p>
+      <w:pPr>
+        <w:pStyle w:val="ListParagraph"/>
+      </w:pPr>
+      <w:r>
+        <w:t>• Timeline API lọc và phân trang tại database boundary; chỉ tải actor và agreement version của trang hiện tại.</w:t>
+      </w:r>
+    </w:p>
+    <w:p>
+      <w:pPr>
+        <w:pStyle w:val="ListParagraph"/>
+      </w:pPr>
+      <w:r>
+        <w:t>• Điều khoản cập nhật hiển thị old/new đã qua AuditPayloadSanitizer; Admin và customer dùng cùng event description canonical.</w:t>
+      </w:r>
+    </w:p>
+    <w:p>
+      <w:pPr>
+        <w:pStyle w:val="ListParagraph"/>
+      </w:pPr>
+      <w:r>
+        <w:t>• Contract hiện tại: 2026-08-06.6, API v70. Runtime Pint/PHPUnit/lint/build/browser/release phải chạy lại trên Git HEAD có dependencies đầy đủ.</w:t>
+      </w:r>
+    </w:p>
+    <w:p>
+      <w:pPr>
+        <w:pStyle w:val="Heading1"/>
+      </w:pPr>
+      <w:r>
+        <w:t>Generated Laravel cache source-clean closure</w:t>
+      </w:r>
+    </w:p>
+    <w:p>
+      <w:pPr>
+        <w:pStyle w:val="ListParagraph"/>
+      </w:pPr>
+      <w:r>
+        <w:t>• bootstrap/cache/packages.php và bootstrap/cache/services.php đã được loại khỏi source package.</w:t>
+      </w:r>
+    </w:p>
+    <w:p>
+      <w:pPr>
+        <w:pStyle w:val="ListParagraph"/>
+      </w:pPr>
+      <w:r>
+        <w:t>• Release-package và recovery-baseline checker đều fail-closed với generated cache; chỉ .gitignore được phép tồn tại.</w:t>
+      </w:r>
+    </w:p>
+    <w:p>
+      <w:pPr>
+        <w:pStyle w:val="ListParagraph"/>
+      </w:pPr>
+      <w:r>
+        <w:t>• Regression probe xác nhận checker từ chối generated cache trước khi đóng ZIP.</w:t>
       </w:r>
     </w:p>
     <w:sectPr>

</xml_diff>